<commit_message>
Atualizando o Ciência Jovem
</commit_message>
<xml_diff>
--- a/Grupo_De_Pesquisa/Projeto_Arduino_Agronegocio/RelatorioProjeto/RelatorioSemCaixa/RelatorioFacepeVersaoFinal.docx
+++ b/Grupo_De_Pesquisa/Projeto_Arduino_Agronegocio/RelatorioProjeto/RelatorioSemCaixa/RelatorioFacepeVersaoFinal.docx
@@ -17196,8 +17196,10 @@
                 <w:rStyle w:val="Forte"/>
                 <w:b w:val="0"/>
               </w:rPr>
-              <w:t>90</w:t>
+              <w:t>100</w:t>
             </w:r>
+            <w:bookmarkStart w:id="0" w:name="_GoBack"/>
+            <w:bookmarkEnd w:id="0"/>
             <w:r>
               <w:rPr>
                 <w:rStyle w:val="Forte"/>
@@ -17509,6 +17511,70 @@
           <w:lang w:val="pt-BR" w:eastAsia="pt-BR"/>
         </w:rPr>
         <w:t xml:space="preserve"> indica os produtos concretos do projeto, considerando a quantidade de relatórios e gráficos estatísticos gerados a partir dos dados coletados.</w:t>
+      </w:r>
+      <w:r>
+        <w:rPr>
+          <w:rFonts w:ascii="Times New Roman" w:eastAsia="Times New Roman" w:hAnsi="Times New Roman" w:cs="Times New Roman"/>
+          <w:sz w:val="24"/>
+          <w:szCs w:val="24"/>
+          <w:lang w:val="pt-BR" w:eastAsia="pt-BR"/>
+        </w:rPr>
+        <w:t xml:space="preserve"> </w:t>
+      </w:r>
+    </w:p>
+    <w:p>
+      <w:pPr>
+        <w:widowControl/>
+        <w:autoSpaceDE/>
+        <w:autoSpaceDN/>
+        <w:spacing w:before="100" w:beforeAutospacing="1" w:after="100" w:afterAutospacing="1"/>
+        <w:jc w:val="both"/>
+        <w:rPr>
+          <w:rFonts w:ascii="Times New Roman" w:eastAsia="Times New Roman" w:hAnsi="Times New Roman" w:cs="Times New Roman"/>
+          <w:sz w:val="24"/>
+          <w:szCs w:val="24"/>
+          <w:lang w:val="pt-BR" w:eastAsia="pt-BR"/>
+        </w:rPr>
+      </w:pPr>
+      <w:r>
+        <w:rPr>
+          <w:rFonts w:ascii="Times New Roman" w:eastAsia="Times New Roman" w:hAnsi="Times New Roman" w:cs="Times New Roman"/>
+          <w:sz w:val="24"/>
+          <w:szCs w:val="24"/>
+          <w:lang w:val="pt-BR" w:eastAsia="pt-BR"/>
+        </w:rPr>
+        <w:t xml:space="preserve">● </w:t>
+      </w:r>
+      <w:r>
+        <w:rPr>
+          <w:rFonts w:ascii="Times New Roman" w:eastAsia="Times New Roman" w:hAnsi="Times New Roman" w:cs="Times New Roman"/>
+          <w:b/>
+          <w:bCs/>
+          <w:sz w:val="24"/>
+          <w:szCs w:val="24"/>
+          <w:lang w:val="pt-BR" w:eastAsia="pt-BR"/>
+        </w:rPr>
+        <w:t>Impacto</w:t>
+      </w:r>
+      <w:r>
+        <w:rPr>
+          <w:rFonts w:ascii="Times New Roman" w:eastAsia="Times New Roman" w:hAnsi="Times New Roman" w:cs="Times New Roman"/>
+          <w:b/>
+          <w:bCs/>
+          <w:sz w:val="24"/>
+          <w:szCs w:val="24"/>
+          <w:lang w:val="pt-BR" w:eastAsia="pt-BR"/>
+        </w:rPr>
+        <w:t>:</w:t>
+      </w:r>
+      <w:r>
+        <w:rPr>
+          <w:rFonts w:ascii="Times New Roman" w:eastAsia="Times New Roman" w:hAnsi="Times New Roman" w:cs="Times New Roman"/>
+          <w:sz w:val="24"/>
+          <w:szCs w:val="24"/>
+          <w:lang w:val="pt-BR" w:eastAsia="pt-BR"/>
+        </w:rPr>
+        <w:t xml:space="preserve"> indica como o curso impactou nos estudantes e na comunidade.</w:t>
       </w:r>
     </w:p>
     <w:tbl>
@@ -17666,6 +17732,13 @@
               </w:rPr>
               <w:t>Os estudantes concluíram as etapas introdutórias de lógica de programação em C e Python, compreendendo estruturas de controle, funções e manipulação de dados. Todos os bolsistas foram capazes de implementar códigos funcionais em ambas as linguagens, com desempenho satisfatório nas avaliações práticas;</w:t>
             </w:r>
+            <w:r>
+              <w:rPr>
+                <w:sz w:val="20"/>
+                <w:szCs w:val="20"/>
+              </w:rPr>
+              <w:t xml:space="preserve"> No final foram capacitados 11 estudantes com interesse e disponibilidade para participa do curso e realizar projetos.</w:t>
+            </w:r>
           </w:p>
         </w:tc>
       </w:tr>
@@ -17715,26 +17788,47 @@
                 <w:sz w:val="20"/>
                 <w:szCs w:val="20"/>
               </w:rPr>
-              <w:t>Foram realizadas oficinas e aulas práticas abordando desde eletrônica básica até integração de sensores ambientais ao Arduino. Todas as atividades planejadas no cronograma foram executadas, com registros de montagem, testes e análise de resultados em planilhas e relatórios;</w:t>
+              <w:t>Foram realizadas</w:t>
+            </w:r>
+            <w:r>
+              <w:rPr>
+                <w:sz w:val="20"/>
+                <w:szCs w:val="20"/>
+              </w:rPr>
+              <w:t xml:space="preserve"> aulas práticas abordando desde eletrônica básica até integração de sensores ambientais ao Arduino. Todas as atividades planejadas no cronograma foram executadas</w:t>
+            </w:r>
+            <w:r>
+              <w:rPr>
+                <w:sz w:val="20"/>
+                <w:szCs w:val="20"/>
+              </w:rPr>
+              <w:t xml:space="preserve"> </w:t>
+            </w:r>
+            <w:r>
+              <w:rPr>
+                <w:sz w:val="20"/>
+                <w:szCs w:val="20"/>
+              </w:rPr>
+              <w:t xml:space="preserve">e </w:t>
+            </w:r>
+            <w:r>
+              <w:rPr>
+                <w:sz w:val="20"/>
+                <w:szCs w:val="20"/>
+              </w:rPr>
+              <w:t xml:space="preserve">registradas os </w:t>
+            </w:r>
+            <w:r>
+              <w:rPr>
+                <w:sz w:val="20"/>
+                <w:szCs w:val="20"/>
+              </w:rPr>
+              <w:t>resultados em planilhas e relatórios;</w:t>
             </w:r>
           </w:p>
         </w:tc>
       </w:tr>
     </w:tbl>
-    <w:p>
-      <w:pPr>
-        <w:tabs>
-          <w:tab w:val="left" w:pos="1330"/>
-        </w:tabs>
-      </w:pPr>
-    </w:p>
-    <w:p>
-      <w:pPr>
-        <w:tabs>
-          <w:tab w:val="left" w:pos="1330"/>
-        </w:tabs>
-      </w:pPr>
-    </w:p>
     <w:p>
       <w:pPr>
         <w:tabs>
@@ -18044,7 +18138,127 @@
                 <w:sz w:val="20"/>
                 <w:szCs w:val="20"/>
               </w:rPr>
-              <w:t>Foram gerados relatórios técnicos e gráficos interpretando as condições ambientais monitoradas. O grupo produziu documentação completa do sistema, incluindo código-fonte comentado, gráficos de dispersão e relatórios de desempenho, utilizados tanto para o relatório da FACEPE quanto para a vitrine da Berro Tech.</w:t>
+              <w:t>Foram gerados relatórios técnicos e gráficos interpretando as condições ambientais monitoradas. O grupo produziu documentação completa do sistema, incluindo código-fonte comentado, gráficos de dispersão e relatórios de desempenho, utilizados tanto para o relatório da</w:t>
+            </w:r>
+            <w:r>
+              <w:rPr>
+                <w:sz w:val="20"/>
+                <w:szCs w:val="20"/>
+              </w:rPr>
+              <w:t xml:space="preserve"> FACEPE quanto para apresenta</w:t>
+            </w:r>
+            <w:r>
+              <w:rPr>
+                <w:sz w:val="20"/>
+                <w:szCs w:val="20"/>
+              </w:rPr>
+              <w:t>ções</w:t>
+            </w:r>
+            <w:r>
+              <w:rPr>
+                <w:sz w:val="20"/>
+                <w:szCs w:val="20"/>
+              </w:rPr>
+              <w:t xml:space="preserve"> em Amostra Cientifica</w:t>
+            </w:r>
+            <w:r>
+              <w:rPr>
+                <w:sz w:val="20"/>
+                <w:szCs w:val="20"/>
+              </w:rPr>
+              <w:t>.</w:t>
+            </w:r>
+          </w:p>
+        </w:tc>
+      </w:tr>
+      <w:tr>
+        <w:tc>
+          <w:tcPr>
+            <w:tcW w:w="4270" w:type="dxa"/>
+          </w:tcPr>
+          <w:p>
+            <w:pPr>
+              <w:pStyle w:val="TableParagraph"/>
+              <w:spacing w:before="101"/>
+              <w:ind w:left="100"/>
+              <w:jc w:val="both"/>
+              <w:rPr>
+                <w:sz w:val="20"/>
+                <w:szCs w:val="20"/>
+              </w:rPr>
+            </w:pPr>
+            <w:r>
+              <w:rPr>
+                <w:sz w:val="20"/>
+                <w:szCs w:val="20"/>
+              </w:rPr>
+              <w:t xml:space="preserve">Impacto </w:t>
+            </w:r>
+          </w:p>
+        </w:tc>
+        <w:tc>
+          <w:tcPr>
+            <w:tcW w:w="4939" w:type="dxa"/>
+          </w:tcPr>
+          <w:p>
+            <w:pPr>
+              <w:pStyle w:val="TableParagraph"/>
+              <w:jc w:val="both"/>
+              <w:rPr>
+                <w:sz w:val="20"/>
+                <w:szCs w:val="20"/>
+              </w:rPr>
+            </w:pPr>
+            <w:r>
+              <w:rPr>
+                <w:sz w:val="20"/>
+                <w:szCs w:val="20"/>
+              </w:rPr>
+              <w:t xml:space="preserve">Os estudantes passaram a </w:t>
+            </w:r>
+            <w:r>
+              <w:rPr>
+                <w:rStyle w:val="Forte"/>
+                <w:sz w:val="20"/>
+                <w:szCs w:val="20"/>
+              </w:rPr>
+              <w:t>compreender e aplicar o método científico</w:t>
+            </w:r>
+            <w:r>
+              <w:rPr>
+                <w:sz w:val="20"/>
+                <w:szCs w:val="20"/>
+              </w:rPr>
+              <w:t xml:space="preserve"> de forma prática, realizando coleta, registro e análise de dados reais do solo.</w:t>
+            </w:r>
+            <w:r>
+              <w:rPr>
+                <w:sz w:val="20"/>
+                <w:szCs w:val="20"/>
+              </w:rPr>
+              <w:t xml:space="preserve"> Por meio dos estudantes a</w:t>
+            </w:r>
+            <w:r>
+              <w:rPr>
+                <w:sz w:val="20"/>
+                <w:szCs w:val="20"/>
+              </w:rPr>
+              <w:t xml:space="preserve"> comunidade passou a compreender melhor a importância da </w:t>
+            </w:r>
+            <w:r>
+              <w:rPr>
+                <w:rStyle w:val="Forte"/>
+                <w:sz w:val="20"/>
+                <w:szCs w:val="20"/>
+              </w:rPr>
+              <w:t>gestão do solo</w:t>
+            </w:r>
+            <w:r>
+              <w:rPr>
+                <w:sz w:val="20"/>
+                <w:szCs w:val="20"/>
+              </w:rPr>
+              <w:t>, preservação e uso sustentável dos recursos naturais.</w:t>
             </w:r>
           </w:p>
         </w:tc>
@@ -18278,6 +18492,51 @@
       <w:r>
         <w:t xml:space="preserve"> pode ser usado na agricultura para facilitar o trabalho e economizar água.</w:t>
       </w:r>
+    </w:p>
+    <w:p>
+      <w:pPr>
+        <w:widowControl/>
+        <w:autoSpaceDE/>
+        <w:autoSpaceDN/>
+        <w:spacing w:before="100" w:beforeAutospacing="1" w:after="100" w:afterAutospacing="1"/>
+        <w:jc w:val="both"/>
+        <w:rPr>
+          <w:rFonts w:ascii="Times New Roman" w:eastAsia="Times New Roman" w:hAnsi="Times New Roman" w:cs="Times New Roman"/>
+          <w:sz w:val="24"/>
+          <w:szCs w:val="24"/>
+          <w:lang w:val="pt-BR" w:eastAsia="pt-BR"/>
+        </w:rPr>
+      </w:pPr>
+    </w:p>
+    <w:p>
+      <w:pPr>
+        <w:widowControl/>
+        <w:autoSpaceDE/>
+        <w:autoSpaceDN/>
+        <w:spacing w:before="100" w:beforeAutospacing="1" w:after="100" w:afterAutospacing="1"/>
+        <w:jc w:val="both"/>
+        <w:rPr>
+          <w:rFonts w:ascii="Times New Roman" w:eastAsia="Times New Roman" w:hAnsi="Times New Roman" w:cs="Times New Roman"/>
+          <w:sz w:val="24"/>
+          <w:szCs w:val="24"/>
+          <w:lang w:val="pt-BR" w:eastAsia="pt-BR"/>
+        </w:rPr>
+      </w:pPr>
+    </w:p>
+    <w:p>
+      <w:pPr>
+        <w:widowControl/>
+        <w:autoSpaceDE/>
+        <w:autoSpaceDN/>
+        <w:spacing w:before="100" w:beforeAutospacing="1" w:after="100" w:afterAutospacing="1"/>
+        <w:jc w:val="both"/>
+        <w:rPr>
+          <w:rFonts w:ascii="Times New Roman" w:eastAsia="Times New Roman" w:hAnsi="Times New Roman" w:cs="Times New Roman"/>
+          <w:sz w:val="24"/>
+          <w:szCs w:val="24"/>
+          <w:lang w:val="pt-BR" w:eastAsia="pt-BR"/>
+        </w:rPr>
+      </w:pPr>
     </w:p>
     <w:p>
       <w:pPr>
@@ -18419,35 +18678,6 @@
         </w:rPr>
         <w:t>, permitindo acompanhar as informações pelo celular ou computador.</w:t>
       </w:r>
-    </w:p>
-    <w:p>
-      <w:pPr>
-        <w:pStyle w:val="Corpodetexto"/>
-        <w:spacing w:before="3"/>
-        <w:rPr>
-          <w:sz w:val="24"/>
-        </w:rPr>
-      </w:pPr>
-      <w:bookmarkStart w:id="0" w:name="_GoBack"/>
-      <w:bookmarkEnd w:id="0"/>
-    </w:p>
-    <w:p>
-      <w:pPr>
-        <w:pStyle w:val="Corpodetexto"/>
-        <w:spacing w:before="3"/>
-        <w:rPr>
-          <w:sz w:val="24"/>
-        </w:rPr>
-      </w:pPr>
-    </w:p>
-    <w:p>
-      <w:pPr>
-        <w:pStyle w:val="Corpodetexto"/>
-        <w:spacing w:before="3"/>
-        <w:rPr>
-          <w:sz w:val="24"/>
-        </w:rPr>
-      </w:pPr>
     </w:p>
     <w:p>
       <w:pPr>
@@ -19876,7 +20106,7 @@
                               <w:noProof/>
                               <w:sz w:val="20"/>
                             </w:rPr>
-                            <w:t>10</w:t>
+                            <w:t>25</w:t>
                           </w:r>
                           <w:r>
                             <w:rPr>
@@ -20000,7 +20230,7 @@
                         <w:noProof/>
                         <w:sz w:val="20"/>
                       </w:rPr>
-                      <w:t>10</w:t>
+                      <w:t>25</w:t>
                     </w:r>
                     <w:r>
                       <w:rPr>
@@ -28453,7 +28683,7 @@
 </file>
 
 <file path=customXml/itemProps1.xml><?xml version="1.0" encoding="utf-8"?>
-<ds:datastoreItem xmlns:ds="http://schemas.openxmlformats.org/officeDocument/2006/customXml" ds:itemID="{B4F82D3D-0EFE-4829-8A35-9DE4F4C712CD}">
+<ds:datastoreItem xmlns:ds="http://schemas.openxmlformats.org/officeDocument/2006/customXml" ds:itemID="{43776E7F-7E2F-467E-99DF-08FC12A088C7}">
   <ds:schemaRefs>
     <ds:schemaRef ds:uri="http://schemas.openxmlformats.org/officeDocument/2006/bibliography"/>
   </ds:schemaRefs>

</xml_diff>